<commit_message>
Security: remove all hardcoded credentials from API guide
- Replace ALL hardcoded API key references with os.environ["HEALTHCARE_API_KEY"]
- Replace ALL hardcoded base URL references with os.environ["HEALTHCARE_API_BASE"]
- Replace all shell examples with $HEALTHCARE_API_KEY / $HEALTHCARE_API_BASE vars
- Replace all JavaScript examples with process.env.HEALTHCARE_API_KEY
- Add AWS CLI retrieval instructions for key and base URL in Section 9.2
- Add env var setup comments in Section 13 evaluation script
- Fix malformed curl commands (duplicate -H flag, missing line continuation \\)
- Regenerate NLP_Healthcare_API_Integration_Guide.docx from updated script

Resolves GitGuardian alert: X-API-Key Secret exposed in previous commit.
Old key permanently deleted from AWS. New key retrieved via AWS CLI only.

Co-Authored-By: Claude Sonnet 4.6 <noreply@anthropic.com>
</commit_message>
<xml_diff>
--- a/ML/sentiment/nltk-transformer/nlp-analyzer/nlp-topic-analysis-pretrained-models/docs/NLP_Healthcare_API_Integration_Guide.docx
+++ b/ML/sentiment/nltk-transformer/nlp-analyzer/nlp-topic-analysis-pretrained-models/docs/NLP_Healthcare_API_Integration_Guide.docx
@@ -826,7 +826,7 @@
                 <w:color w:val="333333"/>
                 <w:sz w:val="19"/>
               </w:rPr>
-              <w:t>ViHNt3GVMXz7bWfRnPTu1FvzR1Tvm8F19SgNlJ12</w:t>
+              <w:t>Retrieve from AWS — see Step 2 below (never hardcode)</w:t>
             </w:r>
           </w:p>
         </w:tc>
@@ -917,7 +917,7 @@
           <w:color w:val="333333"/>
           <w:sz w:val="20"/>
         </w:rPr>
-        <w:t>Keep your API key private. Do not commit it to Git or share it in public channels. Store it in an environment variable or a secrets manager.</w:t>
+        <w:t>NEVER paste the API key directly into your source code or commit it to Git. Always retrieve it from AWS at runtime or store it in an environment variable. Hardcoded keys in code repositories are automatically detected by security scanners and must be rotated immediately.</w:t>
       </w:r>
     </w:p>
     <w:p>
@@ -930,7 +930,7 @@
           <w:color w:val="007A87"/>
           <w:sz w:val="28"/>
         </w:rPr>
-        <w:t>Step 2 — Set Shell Variables (Terminal / Command Line)</w:t>
+        <w:t>Step 2 — Retrieve Your API Key from AWS &amp; Set Shell Variables</w:t>
       </w:r>
     </w:p>
     <w:p>
@@ -942,7 +942,7 @@
           <w:color w:val="333333"/>
           <w:sz w:val="21"/>
         </w:rPr>
-        <w:t>Open a terminal and run these two lines. They save the URL and key so you don't have to retype them:</w:t>
+        <w:t>The API key is stored securely in AWS API Gateway — not in any file. Run the following commands in your terminal to retrieve it and save it to shell variables for use in subsequent steps:</w:t>
       </w:r>
     </w:p>
     <w:tbl>
@@ -970,26 +970,188 @@
                 <w:color w:val="1A1A2E"/>
                 <w:sz w:val="17"/>
               </w:rPr>
-              <w:t>BASE="https://5kzn638wee.execute-api.ap-southeast-2.amazonaws.com/prod"</w:t>
-            </w:r>
-          </w:p>
-          <w:p>
-            <w:pPr>
-              <w:spacing w:before="0" w:after="0"/>
-            </w:pPr>
-            <w:r>
-              <w:rPr>
-                <w:rFonts w:ascii="Courier New" w:hAnsi="Courier New"/>
-                <w:color w:val="1A1A2E"/>
-                <w:sz w:val="17"/>
-              </w:rPr>
-              <w:t>KEY="ViHNt3GVMXz7bWfRnPTu1FvzR1Tvm8F19SgNlJ12"</w:t>
+              <w:t># Retrieve the API key from AWS (requires AWS CLI configured with ap-southeast-2 access)</w:t>
+            </w:r>
+          </w:p>
+          <w:p>
+            <w:pPr>
+              <w:spacing w:before="0" w:after="0"/>
+            </w:pPr>
+            <w:r>
+              <w:rPr>
+                <w:rFonts w:ascii="Courier New" w:hAnsi="Courier New"/>
+                <w:color w:val="1A1A2E"/>
+                <w:sz w:val="17"/>
+              </w:rPr>
+              <w:t>export HEALTHCARE_API_KEY=$(aws apigateway get-api-keys \</w:t>
+            </w:r>
+          </w:p>
+          <w:p>
+            <w:pPr>
+              <w:spacing w:before="0" w:after="0"/>
+            </w:pPr>
+            <w:r>
+              <w:rPr>
+                <w:rFonts w:ascii="Courier New" w:hAnsi="Courier New"/>
+                <w:color w:val="1A1A2E"/>
+                <w:sz w:val="17"/>
+              </w:rPr>
+              <w:t xml:space="preserve">  --region ap-southeast-2 \</w:t>
+            </w:r>
+          </w:p>
+          <w:p>
+            <w:pPr>
+              <w:spacing w:before="0" w:after="0"/>
+            </w:pPr>
+            <w:r>
+              <w:rPr>
+                <w:rFonts w:ascii="Courier New" w:hAnsi="Courier New"/>
+                <w:color w:val="1A1A2E"/>
+                <w:sz w:val="17"/>
+              </w:rPr>
+              <w:t xml:space="preserve">  --include-values \</w:t>
+            </w:r>
+          </w:p>
+          <w:p>
+            <w:pPr>
+              <w:spacing w:before="0" w:after="0"/>
+            </w:pPr>
+            <w:r>
+              <w:rPr>
+                <w:rFonts w:ascii="Courier New" w:hAnsi="Courier New"/>
+                <w:color w:val="1A1A2E"/>
+                <w:sz w:val="17"/>
+              </w:rPr>
+              <w:t xml:space="preserve">  --query "items[?contains(name,'healthcare-topic-classifier')].value | [0]" \</w:t>
+            </w:r>
+          </w:p>
+          <w:p>
+            <w:pPr>
+              <w:spacing w:before="0" w:after="0"/>
+            </w:pPr>
+            <w:r>
+              <w:rPr>
+                <w:rFonts w:ascii="Courier New" w:hAnsi="Courier New"/>
+                <w:color w:val="1A1A2E"/>
+                <w:sz w:val="17"/>
+              </w:rPr>
+              <w:t xml:space="preserve">  --output text)</w:t>
+            </w:r>
+          </w:p>
+          <w:p>
+            <w:pPr>
+              <w:spacing w:before="0" w:after="0"/>
+            </w:pPr>
+            <w:r>
+              <w:rPr>
+                <w:rFonts w:ascii="Courier New" w:hAnsi="Courier New"/>
+                <w:color w:val="1A1A2E"/>
+                <w:sz w:val="17"/>
+              </w:rPr>
+            </w:r>
+          </w:p>
+          <w:p>
+            <w:pPr>
+              <w:spacing w:before="0" w:after="0"/>
+            </w:pPr>
+            <w:r>
+              <w:rPr>
+                <w:rFonts w:ascii="Courier New" w:hAnsi="Courier New"/>
+                <w:color w:val="1A1A2E"/>
+                <w:sz w:val="17"/>
+              </w:rPr>
+              <w:t># Set the base URL</w:t>
+            </w:r>
+          </w:p>
+          <w:p>
+            <w:pPr>
+              <w:spacing w:before="0" w:after="0"/>
+            </w:pPr>
+            <w:r>
+              <w:rPr>
+                <w:rFonts w:ascii="Courier New" w:hAnsi="Courier New"/>
+                <w:color w:val="1A1A2E"/>
+                <w:sz w:val="17"/>
+              </w:rPr>
+              <w:t>export HEALTHCARE_API_BASE="$HEALTHCARE_API_BASE"</w:t>
+            </w:r>
+          </w:p>
+          <w:p>
+            <w:pPr>
+              <w:spacing w:before="0" w:after="0"/>
+            </w:pPr>
+            <w:r>
+              <w:rPr>
+                <w:rFonts w:ascii="Courier New" w:hAnsi="Courier New"/>
+                <w:color w:val="1A1A2E"/>
+                <w:sz w:val="17"/>
+              </w:rPr>
+            </w:r>
+          </w:p>
+          <w:p>
+            <w:pPr>
+              <w:spacing w:before="0" w:after="0"/>
+            </w:pPr>
+            <w:r>
+              <w:rPr>
+                <w:rFonts w:ascii="Courier New" w:hAnsi="Courier New"/>
+                <w:color w:val="1A1A2E"/>
+                <w:sz w:val="17"/>
+              </w:rPr>
+              <w:t># Verify both are set</w:t>
+            </w:r>
+          </w:p>
+          <w:p>
+            <w:pPr>
+              <w:spacing w:before="0" w:after="0"/>
+            </w:pPr>
+            <w:r>
+              <w:rPr>
+                <w:rFonts w:ascii="Courier New" w:hAnsi="Courier New"/>
+                <w:color w:val="1A1A2E"/>
+                <w:sz w:val="17"/>
+              </w:rPr>
+              <w:t>echo "Base URL : $HEALTHCARE_API_BASE"</w:t>
+            </w:r>
+          </w:p>
+          <w:p>
+            <w:pPr>
+              <w:spacing w:before="0" w:after="0"/>
+            </w:pPr>
+            <w:r>
+              <w:rPr>
+                <w:rFonts w:ascii="Courier New" w:hAnsi="Courier New"/>
+                <w:color w:val="1A1A2E"/>
+                <w:sz w:val="17"/>
+              </w:rPr>
+              <w:t>echo "Key set  : ${HEALTHCARE_API_KEY:0:4}************************"  # shows only first 4 chars</w:t>
             </w:r>
           </w:p>
         </w:tc>
       </w:tr>
     </w:tbl>
     <w:p/>
+    <w:p>
+      <w:pPr>
+        <w:spacing w:before="120" w:after="120"/>
+        <w:ind w:left="283" w:right="283"/>
+      </w:pPr>
+      <w:r>
+        <w:rPr>
+          <w:b/>
+          <w:color w:val="1E7E34"/>
+          <w:sz w:val="20"/>
+        </w:rPr>
+        <w:t xml:space="preserve">💡 Tip:  </w:t>
+      </w:r>
+      <w:r>
+        <w:rPr>
+          <w:color w:val="333333"/>
+          <w:sz w:val="20"/>
+        </w:rPr>
+        <w:t>The echo command above intentionally shows only the first 4 characters of the key so you can confirm it loaded without revealing the full value in your terminal history.</w:t>
+      </w:r>
+    </w:p>
     <w:p>
       <w:pPr>
         <w:pStyle w:val="Heading2"/>
@@ -1040,20 +1202,20 @@
                 <w:color w:val="1A1A2E"/>
                 <w:sz w:val="17"/>
               </w:rPr>
-              <w:t>curl -s "$BASE/health" \</w:t>
-            </w:r>
-          </w:p>
-          <w:p>
-            <w:pPr>
-              <w:spacing w:before="0" w:after="0"/>
-            </w:pPr>
-            <w:r>
-              <w:rPr>
-                <w:rFonts w:ascii="Courier New" w:hAnsi="Courier New"/>
-                <w:color w:val="1A1A2E"/>
-                <w:sz w:val="17"/>
-              </w:rPr>
-              <w:t xml:space="preserve">  -H "x-api-key: $KEY" \</w:t>
+              <w:t>curl -s "$HEALTHCARE_API_BASE/health" \</w:t>
+            </w:r>
+          </w:p>
+          <w:p>
+            <w:pPr>
+              <w:spacing w:before="0" w:after="0"/>
+            </w:pPr>
+            <w:r>
+              <w:rPr>
+                <w:rFonts w:ascii="Courier New" w:hAnsi="Courier New"/>
+                <w:color w:val="1A1A2E"/>
+                <w:sz w:val="17"/>
+              </w:rPr>
+              <w:t xml:space="preserve">  -H "x-api-key: $HEALTHCARE_API_KEY" \</w:t>
             </w:r>
           </w:p>
           <w:p>
@@ -1318,7 +1480,7 @@
                 <w:color w:val="1A1A2E"/>
                 <w:sz w:val="17"/>
               </w:rPr>
-              <w:t>curl -s -X POST "$BASE/classify" \</w:t>
+              <w:t>curl -s -X POST "$HEALTHCARE_API_BASE/classify" \</w:t>
             </w:r>
           </w:p>
           <w:p>
@@ -1344,7 +1506,7 @@
                 <w:color w:val="1A1A2E"/>
                 <w:sz w:val="17"/>
               </w:rPr>
-              <w:t xml:space="preserve">  -H "x-api-key: $KEY" \</w:t>
+              <w:t xml:space="preserve">  -H "x-api-key: $HEALTHCARE_API_KEY" \</w:t>
             </w:r>
           </w:p>
           <w:p>
@@ -1638,7 +1800,7 @@
                 <w:color w:val="333333"/>
                 <w:sz w:val="19"/>
               </w:rPr>
-              <w:t>ViHNt3GVMXz7bWfRnPTu1FvzR1Tvm8F19SgNlJ12</w:t>
+              <w:t>$HEALTHCARE_API_KEY  (retrieve from AWS — see Section 2, Step 2)</w:t>
             </w:r>
           </w:p>
         </w:tc>
@@ -2010,20 +2172,20 @@
                 <w:color w:val="1A1A2E"/>
                 <w:sz w:val="17"/>
               </w:rPr>
-              <w:t>curl -s "https://5kzn638wee.execute-api.ap-southeast-2.amazonaws.com/prod/health" \</w:t>
-            </w:r>
-          </w:p>
-          <w:p>
-            <w:pPr>
-              <w:spacing w:before="0" w:after="0"/>
-            </w:pPr>
-            <w:r>
-              <w:rPr>
-                <w:rFonts w:ascii="Courier New" w:hAnsi="Courier New"/>
-                <w:color w:val="1A1A2E"/>
-                <w:sz w:val="17"/>
-              </w:rPr>
-              <w:t xml:space="preserve">  -H "x-api-key: ViHNt3GVMXz7bWfRnPTu1FvzR1Tvm8F19SgNlJ12"</w:t>
+              <w:t>curl -s "$HEALTHCARE_API_BASE/health" \</w:t>
+            </w:r>
+          </w:p>
+          <w:p>
+            <w:pPr>
+              <w:spacing w:before="0" w:after="0"/>
+            </w:pPr>
+            <w:r>
+              <w:rPr>
+                <w:rFonts w:ascii="Courier New" w:hAnsi="Courier New"/>
+                <w:color w:val="1A1A2E"/>
+                <w:sz w:val="17"/>
+              </w:rPr>
+              <w:t xml:space="preserve">  -H "x-api-key: $HEALTHCARE_API_KEY"</w:t>
             </w:r>
           </w:p>
         </w:tc>
@@ -4144,7 +4306,7 @@
                 <w:color w:val="1A1A2E"/>
                 <w:sz w:val="17"/>
               </w:rPr>
-              <w:t>x-api-key: ViHNt3GVMXz7bWfRnPTu1FvzR1Tvm8F19SgNlJ12</w:t>
+              <w:t>x-api-key: $HEALTHCARE_API_KEY</w:t>
             </w:r>
           </w:p>
           <w:p>
@@ -5580,20 +5742,20 @@
                 <w:color w:val="1A1A2E"/>
                 <w:sz w:val="17"/>
               </w:rPr>
-              <w:t>curl -s "$BASE/health" \</w:t>
-            </w:r>
-          </w:p>
-          <w:p>
-            <w:pPr>
-              <w:spacing w:before="0" w:after="0"/>
-            </w:pPr>
-            <w:r>
-              <w:rPr>
-                <w:rFonts w:ascii="Courier New" w:hAnsi="Courier New"/>
-                <w:color w:val="1A1A2E"/>
-                <w:sz w:val="17"/>
-              </w:rPr>
-              <w:t xml:space="preserve">  -H "x-api-key: $KEY" \</w:t>
+              <w:t>curl -s "$HEALTHCARE_API_BASE/health" \</w:t>
+            </w:r>
+          </w:p>
+          <w:p>
+            <w:pPr>
+              <w:spacing w:before="0" w:after="0"/>
+            </w:pPr>
+            <w:r>
+              <w:rPr>
+                <w:rFonts w:ascii="Courier New" w:hAnsi="Courier New"/>
+                <w:color w:val="1A1A2E"/>
+                <w:sz w:val="17"/>
+              </w:rPr>
+              <w:t xml:space="preserve">  -H "x-api-key: $HEALTHCARE_API_KEY" \</w:t>
             </w:r>
           </w:p>
           <w:p>
@@ -5652,7 +5814,7 @@
                 <w:color w:val="1A1A2E"/>
                 <w:sz w:val="17"/>
               </w:rPr>
-              <w:t>curl -s -X POST "$BASE/classify" \</w:t>
+              <w:t>curl -s -X POST "$HEALTHCARE_API_BASE/classify" \</w:t>
             </w:r>
           </w:p>
           <w:p>
@@ -5678,7 +5840,7 @@
                 <w:color w:val="1A1A2E"/>
                 <w:sz w:val="17"/>
               </w:rPr>
-              <w:t xml:space="preserve">  -H "x-api-key: $KEY" \</w:t>
+              <w:t xml:space="preserve">  -H "x-api-key: $HEALTHCARE_API_KEY" \</w:t>
             </w:r>
           </w:p>
           <w:p>
@@ -5789,7 +5951,7 @@
                 <w:color w:val="1A1A2E"/>
                 <w:sz w:val="17"/>
               </w:rPr>
-              <w:t>curl -s -X POST "$BASE/classify" \</w:t>
+              <w:t>curl -s -X POST "$HEALTHCARE_API_BASE/classify" \</w:t>
             </w:r>
           </w:p>
           <w:p>
@@ -5815,7 +5977,7 @@
                 <w:color w:val="1A1A2E"/>
                 <w:sz w:val="17"/>
               </w:rPr>
-              <w:t xml:space="preserve">  -H "x-api-key: $KEY" \</w:t>
+              <w:t xml:space="preserve">  -H "x-api-key: $HEALTHCARE_API_KEY" \</w:t>
             </w:r>
           </w:p>
           <w:p>
@@ -5998,6 +6160,27 @@
     <w:p/>
     <w:p>
       <w:pPr>
+        <w:spacing w:before="120" w:after="120"/>
+        <w:ind w:left="283" w:right="283"/>
+      </w:pPr>
+      <w:r>
+        <w:rPr>
+          <w:b/>
+          <w:color w:val="D36A00"/>
+          <w:sz w:val="20"/>
+        </w:rPr>
+        <w:t xml:space="preserve">⚠️  Important:  </w:t>
+      </w:r>
+      <w:r>
+        <w:rPr>
+          <w:color w:val="333333"/>
+          <w:sz w:val="20"/>
+        </w:rPr>
+        <w:t>All Python examples load the API key from the HEALTHCARE_API_KEY environment variable. Never hardcode the key as a string in your source code.</w:t>
+      </w:r>
+    </w:p>
+    <w:p>
+      <w:pPr>
         <w:pStyle w:val="Heading3"/>
         <w:spacing w:before="200" w:after="60"/>
       </w:pPr>
@@ -6035,6 +6218,19 @@
                 <w:color w:val="1A1A2E"/>
                 <w:sz w:val="17"/>
               </w:rPr>
+              <w:t>import os</w:t>
+            </w:r>
+          </w:p>
+          <w:p>
+            <w:pPr>
+              <w:spacing w:before="0" w:after="0"/>
+            </w:pPr>
+            <w:r>
+              <w:rPr>
+                <w:rFonts w:ascii="Courier New" w:hAnsi="Courier New"/>
+                <w:color w:val="1A1A2E"/>
+                <w:sz w:val="17"/>
+              </w:rPr>
               <w:t>import requests</w:t>
             </w:r>
           </w:p>
@@ -6048,58 +6244,45 @@
                 <w:color w:val="1A1A2E"/>
                 <w:sz w:val="17"/>
               </w:rPr>
-              <w:t>import json</w:t>
-            </w:r>
-          </w:p>
-          <w:p>
-            <w:pPr>
-              <w:spacing w:before="0" w:after="0"/>
-            </w:pPr>
-            <w:r>
-              <w:rPr>
-                <w:rFonts w:ascii="Courier New" w:hAnsi="Courier New"/>
-                <w:color w:val="1A1A2E"/>
-                <w:sz w:val="17"/>
-              </w:rPr>
-            </w:r>
-          </w:p>
-          <w:p>
-            <w:pPr>
-              <w:spacing w:before="0" w:after="0"/>
-            </w:pPr>
-            <w:r>
-              <w:rPr>
-                <w:rFonts w:ascii="Courier New" w:hAnsi="Courier New"/>
-                <w:color w:val="1A1A2E"/>
-                <w:sz w:val="17"/>
-              </w:rPr>
-              <w:t># ── Configuration ──────────────────────────────────────────────────────────</w:t>
-            </w:r>
-          </w:p>
-          <w:p>
-            <w:pPr>
-              <w:spacing w:before="0" w:after="0"/>
-            </w:pPr>
-            <w:r>
-              <w:rPr>
-                <w:rFonts w:ascii="Courier New" w:hAnsi="Courier New"/>
-                <w:color w:val="1A1A2E"/>
-                <w:sz w:val="17"/>
-              </w:rPr>
-              <w:t>BASE_URL = "https://5kzn638wee.execute-api.ap-southeast-2.amazonaws.com/prod"</w:t>
-            </w:r>
-          </w:p>
-          <w:p>
-            <w:pPr>
-              <w:spacing w:before="0" w:after="0"/>
-            </w:pPr>
-            <w:r>
-              <w:rPr>
-                <w:rFonts w:ascii="Courier New" w:hAnsi="Courier New"/>
-                <w:color w:val="1A1A2E"/>
-                <w:sz w:val="17"/>
-              </w:rPr>
-              <w:t>API_KEY  = "ViHNt3GVMXz7bWfRnPTu1FvzR1Tvm8F19SgNlJ12"</w:t>
+            </w:r>
+          </w:p>
+          <w:p>
+            <w:pPr>
+              <w:spacing w:before="0" w:after="0"/>
+            </w:pPr>
+            <w:r>
+              <w:rPr>
+                <w:rFonts w:ascii="Courier New" w:hAnsi="Courier New"/>
+                <w:color w:val="1A1A2E"/>
+                <w:sz w:val="17"/>
+              </w:rPr>
+              <w:t># ── Load credentials from environment variables (never hardcode!) ───────────</w:t>
+            </w:r>
+          </w:p>
+          <w:p>
+            <w:pPr>
+              <w:spacing w:before="0" w:after="0"/>
+            </w:pPr>
+            <w:r>
+              <w:rPr>
+                <w:rFonts w:ascii="Courier New" w:hAnsi="Courier New"/>
+                <w:color w:val="1A1A2E"/>
+                <w:sz w:val="17"/>
+              </w:rPr>
+              <w:t>BASE_URL = os.environ["HEALTHCARE_API_BASE"]   # set in Step 2 of Quick Start</w:t>
+            </w:r>
+          </w:p>
+          <w:p>
+            <w:pPr>
+              <w:spacing w:before="0" w:after="0"/>
+            </w:pPr>
+            <w:r>
+              <w:rPr>
+                <w:rFonts w:ascii="Courier New" w:hAnsi="Courier New"/>
+                <w:color w:val="1A1A2E"/>
+                <w:sz w:val="17"/>
+              </w:rPr>
+              <w:t>API_KEY  = os.environ["HEALTHCARE_API_KEY"]    # set in Step 2 of Quick Start</w:t>
             </w:r>
           </w:p>
           <w:p>
@@ -6188,7 +6371,7 @@
                 <w:color w:val="1A1A2E"/>
                 <w:sz w:val="17"/>
               </w:rPr>
-              <w:t># ── 1. Health check ────────────────────────────────────────────────────────</w:t>
+              <w:t># ── 1. Health check ─────────────────────────────────────────────────────────</w:t>
             </w:r>
           </w:p>
           <w:p>
@@ -6239,7 +6422,7 @@
                 <w:color w:val="1A1A2E"/>
                 <w:sz w:val="17"/>
               </w:rPr>
-              <w:t># ── 2. Classify a single text ──────────────────────────────────────────────</w:t>
+              <w:t># ── 2. Classify a single text ───────────────────────────────────────────────</w:t>
             </w:r>
           </w:p>
           <w:p>
@@ -6478,6 +6661,19 @@
                 <w:color w:val="1A1A2E"/>
                 <w:sz w:val="17"/>
               </w:rPr>
+              <w:t>import os</w:t>
+            </w:r>
+          </w:p>
+          <w:p>
+            <w:pPr>
+              <w:spacing w:before="0" w:after="0"/>
+            </w:pPr>
+            <w:r>
+              <w:rPr>
+                <w:rFonts w:ascii="Courier New" w:hAnsi="Courier New"/>
+                <w:color w:val="1A1A2E"/>
+                <w:sz w:val="17"/>
+              </w:rPr>
               <w:t>import requests</w:t>
             </w:r>
           </w:p>
@@ -6503,20 +6699,20 @@
                 <w:color w:val="1A1A2E"/>
                 <w:sz w:val="17"/>
               </w:rPr>
-              <w:t>BASE_URL = "https://5kzn638wee.execute-api.ap-southeast-2.amazonaws.com/prod"</w:t>
-            </w:r>
-          </w:p>
-          <w:p>
-            <w:pPr>
-              <w:spacing w:before="0" w:after="0"/>
-            </w:pPr>
-            <w:r>
-              <w:rPr>
-                <w:rFonts w:ascii="Courier New" w:hAnsi="Courier New"/>
-                <w:color w:val="1A1A2E"/>
-                <w:sz w:val="17"/>
-              </w:rPr>
-              <w:t>API_KEY  = "ViHNt3GVMXz7bWfRnPTu1FvzR1Tvm8F19SgNlJ12"</w:t>
+              <w:t>BASE_URL = os.environ["HEALTHCARE_API_BASE"]</w:t>
+            </w:r>
+          </w:p>
+          <w:p>
+            <w:pPr>
+              <w:spacing w:before="0" w:after="0"/>
+            </w:pPr>
+            <w:r>
+              <w:rPr>
+                <w:rFonts w:ascii="Courier New" w:hAnsi="Courier New"/>
+                <w:color w:val="1A1A2E"/>
+                <w:sz w:val="17"/>
+              </w:rPr>
+              <w:t>API_KEY  = os.environ["HEALTHCARE_API_KEY"]</w:t>
             </w:r>
           </w:p>
           <w:p>
@@ -6542,19 +6738,6 @@
                 <w:color w:val="1A1A2E"/>
                 <w:sz w:val="17"/>
               </w:rPr>
-            </w:r>
-          </w:p>
-          <w:p>
-            <w:pPr>
-              <w:spacing w:before="0" w:after="0"/>
-            </w:pPr>
-            <w:r>
-              <w:rPr>
-                <w:rFonts w:ascii="Courier New" w:hAnsi="Courier New"/>
-                <w:color w:val="1A1A2E"/>
-                <w:sz w:val="17"/>
-              </w:rPr>
-              <w:t># A list of patient feedback comments to classify</w:t>
             </w:r>
           </w:p>
           <w:p>
@@ -6870,6 +7053,19 @@
                 <w:color w:val="1A1A2E"/>
                 <w:sz w:val="17"/>
               </w:rPr>
+              <w:t>import os</w:t>
+            </w:r>
+          </w:p>
+          <w:p>
+            <w:pPr>
+              <w:spacing w:before="0" w:after="0"/>
+            </w:pPr>
+            <w:r>
+              <w:rPr>
+                <w:rFonts w:ascii="Courier New" w:hAnsi="Courier New"/>
+                <w:color w:val="1A1A2E"/>
+                <w:sz w:val="17"/>
+              </w:rPr>
               <w:t>import requests</w:t>
             </w:r>
           </w:p>
@@ -6908,20 +7104,20 @@
                 <w:color w:val="1A1A2E"/>
                 <w:sz w:val="17"/>
               </w:rPr>
-              <w:t>BASE_URL = "https://5kzn638wee.execute-api.ap-southeast-2.amazonaws.com/prod"</w:t>
-            </w:r>
-          </w:p>
-          <w:p>
-            <w:pPr>
-              <w:spacing w:before="0" w:after="0"/>
-            </w:pPr>
-            <w:r>
-              <w:rPr>
-                <w:rFonts w:ascii="Courier New" w:hAnsi="Courier New"/>
-                <w:color w:val="1A1A2E"/>
-                <w:sz w:val="17"/>
-              </w:rPr>
-              <w:t>API_KEY  = "ViHNt3GVMXz7bWfRnPTu1FvzR1Tvm8F19SgNlJ12"</w:t>
+              <w:t>BASE_URL = os.environ["HEALTHCARE_API_BASE"]</w:t>
+            </w:r>
+          </w:p>
+          <w:p>
+            <w:pPr>
+              <w:spacing w:before="0" w:after="0"/>
+            </w:pPr>
+            <w:r>
+              <w:rPr>
+                <w:rFonts w:ascii="Courier New" w:hAnsi="Courier New"/>
+                <w:color w:val="1A1A2E"/>
+                <w:sz w:val="17"/>
+              </w:rPr>
+              <w:t>API_KEY  = os.environ["HEALTHCARE_API_KEY"]</w:t>
             </w:r>
           </w:p>
           <w:p>
@@ -7310,7 +7506,7 @@
           <w:color w:val="333333"/>
           <w:sz w:val="21"/>
         </w:rPr>
-        <w:t>Using the built-in fetch API (Node.js 18+) or the axios library.</w:t>
+        <w:t>Using the built-in fetch API (Node.js 18+). Load the key from process.env — never hardcode it.</w:t>
       </w:r>
     </w:p>
     <w:p>
@@ -7324,7 +7520,7 @@
           <w:color w:val="1A3A5C"/>
           <w:sz w:val="23"/>
         </w:rPr>
-        <w:t>Using fetch (Node.js 18+ or modern browser)</w:t>
+        <w:t>Using fetch (Node.js 18+)</w:t>
       </w:r>
     </w:p>
     <w:tbl>
@@ -7352,20 +7548,84 @@
                 <w:color w:val="1A1A2E"/>
                 <w:sz w:val="17"/>
               </w:rPr>
-              <w:t>const BASE_URL = "https://5kzn638wee.execute-api.ap-southeast-2.amazonaws.com/prod";</w:t>
-            </w:r>
-          </w:p>
-          <w:p>
-            <w:pPr>
-              <w:spacing w:before="0" w:after="0"/>
-            </w:pPr>
-            <w:r>
-              <w:rPr>
-                <w:rFonts w:ascii="Courier New" w:hAnsi="Courier New"/>
-                <w:color w:val="1A1A2E"/>
-                <w:sz w:val="17"/>
-              </w:rPr>
-              <w:t>const API_KEY  = "ViHNt3GVMXz7bWfRnPTu1FvzR1Tvm8F19SgNlJ12";</w:t>
+              <w:t>// Load from environment variables (set before running: export HEALTHCARE_API_KEY=...)</w:t>
+            </w:r>
+          </w:p>
+          <w:p>
+            <w:pPr>
+              <w:spacing w:before="0" w:after="0"/>
+            </w:pPr>
+            <w:r>
+              <w:rPr>
+                <w:rFonts w:ascii="Courier New" w:hAnsi="Courier New"/>
+                <w:color w:val="1A1A2E"/>
+                <w:sz w:val="17"/>
+              </w:rPr>
+              <w:t>const BASE_URL = process.env.HEALTHCARE_API_BASE;</w:t>
+            </w:r>
+          </w:p>
+          <w:p>
+            <w:pPr>
+              <w:spacing w:before="0" w:after="0"/>
+            </w:pPr>
+            <w:r>
+              <w:rPr>
+                <w:rFonts w:ascii="Courier New" w:hAnsi="Courier New"/>
+                <w:color w:val="1A1A2E"/>
+                <w:sz w:val="17"/>
+              </w:rPr>
+              <w:t>const API_KEY  = process.env.HEALTHCARE_API_KEY;</w:t>
+            </w:r>
+          </w:p>
+          <w:p>
+            <w:pPr>
+              <w:spacing w:before="0" w:after="0"/>
+            </w:pPr>
+            <w:r>
+              <w:rPr>
+                <w:rFonts w:ascii="Courier New" w:hAnsi="Courier New"/>
+                <w:color w:val="1A1A2E"/>
+                <w:sz w:val="17"/>
+              </w:rPr>
+            </w:r>
+          </w:p>
+          <w:p>
+            <w:pPr>
+              <w:spacing w:before="0" w:after="0"/>
+            </w:pPr>
+            <w:r>
+              <w:rPr>
+                <w:rFonts w:ascii="Courier New" w:hAnsi="Courier New"/>
+                <w:color w:val="1A1A2E"/>
+                <w:sz w:val="17"/>
+              </w:rPr>
+              <w:t>if (!BASE_URL || !API_KEY) {</w:t>
+            </w:r>
+          </w:p>
+          <w:p>
+            <w:pPr>
+              <w:spacing w:before="0" w:after="0"/>
+            </w:pPr>
+            <w:r>
+              <w:rPr>
+                <w:rFonts w:ascii="Courier New" w:hAnsi="Courier New"/>
+                <w:color w:val="1A1A2E"/>
+                <w:sz w:val="17"/>
+              </w:rPr>
+              <w:t xml:space="preserve">  throw new Error("Set HEALTHCARE_API_BASE and HEALTHCARE_API_KEY env vars first.");</w:t>
+            </w:r>
+          </w:p>
+          <w:p>
+            <w:pPr>
+              <w:spacing w:before="0" w:after="0"/>
+            </w:pPr>
+            <w:r>
+              <w:rPr>
+                <w:rFonts w:ascii="Courier New" w:hAnsi="Courier New"/>
+                <w:color w:val="1A1A2E"/>
+                <w:sz w:val="17"/>
+              </w:rPr>
+              <w:t>}</w:t>
             </w:r>
           </w:p>
           <w:p>
@@ -7481,59 +7741,7 @@
                 <w:color w:val="1A1A2E"/>
                 <w:sz w:val="17"/>
               </w:rPr>
-              <w:t xml:space="preserve">    body: JSON.stringify({</w:t>
-            </w:r>
-          </w:p>
-          <w:p>
-            <w:pPr>
-              <w:spacing w:before="0" w:after="0"/>
-            </w:pPr>
-            <w:r>
-              <w:rPr>
-                <w:rFonts w:ascii="Courier New" w:hAnsi="Courier New"/>
-                <w:color w:val="1A1A2E"/>
-                <w:sz w:val="17"/>
-              </w:rPr>
-              <w:t xml:space="preserve">      texts:  texts,</w:t>
-            </w:r>
-          </w:p>
-          <w:p>
-            <w:pPr>
-              <w:spacing w:before="0" w:after="0"/>
-            </w:pPr>
-            <w:r>
-              <w:rPr>
-                <w:rFonts w:ascii="Courier New" w:hAnsi="Courier New"/>
-                <w:color w:val="1A1A2E"/>
-                <w:sz w:val="17"/>
-              </w:rPr>
-              <w:t xml:space="preserve">      models: ["all"],</w:t>
-            </w:r>
-          </w:p>
-          <w:p>
-            <w:pPr>
-              <w:spacing w:before="0" w:after="0"/>
-            </w:pPr>
-            <w:r>
-              <w:rPr>
-                <w:rFonts w:ascii="Courier New" w:hAnsi="Courier New"/>
-                <w:color w:val="1A1A2E"/>
-                <w:sz w:val="17"/>
-              </w:rPr>
-              <w:t xml:space="preserve">      top_n:  3,</w:t>
-            </w:r>
-          </w:p>
-          <w:p>
-            <w:pPr>
-              <w:spacing w:before="0" w:after="0"/>
-            </w:pPr>
-            <w:r>
-              <w:rPr>
-                <w:rFonts w:ascii="Courier New" w:hAnsi="Courier New"/>
-                <w:color w:val="1A1A2E"/>
-                <w:sz w:val="17"/>
-              </w:rPr>
-              <w:t xml:space="preserve">    }),</w:t>
+              <w:t xml:space="preserve">    body: JSON.stringify({ texts, models: ["all"], top_n: 3 }),</w:t>
             </w:r>
           </w:p>
           <w:p>
@@ -7598,18 +7806,6 @@
                 <w:sz w:val="17"/>
               </w:rPr>
               <w:t xml:space="preserve">  }</w:t>
-            </w:r>
-          </w:p>
-          <w:p>
-            <w:pPr>
-              <w:spacing w:before="0" w:after="0"/>
-            </w:pPr>
-            <w:r>
-              <w:rPr>
-                <w:rFonts w:ascii="Courier New" w:hAnsi="Courier New"/>
-                <w:color w:val="1A1A2E"/>
-                <w:sz w:val="17"/>
-              </w:rPr>
             </w:r>
           </w:p>
           <w:p>
@@ -7904,20 +8100,20 @@
                 <w:color w:val="1A1A2E"/>
                 <w:sz w:val="17"/>
               </w:rPr>
-              <w:t>BASE="https://5kzn638wee.execute-api.ap-southeast-2.amazonaws.com/prod"</w:t>
-            </w:r>
-          </w:p>
-          <w:p>
-            <w:pPr>
-              <w:spacing w:before="0" w:after="0"/>
-            </w:pPr>
-            <w:r>
-              <w:rPr>
-                <w:rFonts w:ascii="Courier New" w:hAnsi="Courier New"/>
-                <w:color w:val="1A1A2E"/>
-                <w:sz w:val="17"/>
-              </w:rPr>
-              <w:t>KEY="ViHNt3GVMXz7bWfRnPTu1FvzR1Tvm8F19SgNlJ12"</w:t>
+              <w:t>BASE="$HEALTHCARE_API_BASE"</w:t>
+            </w:r>
+          </w:p>
+          <w:p>
+            <w:pPr>
+              <w:spacing w:before="0" w:after="0"/>
+            </w:pPr>
+            <w:r>
+              <w:rPr>
+                <w:rFonts w:ascii="Courier New" w:hAnsi="Courier New"/>
+                <w:color w:val="1A1A2E"/>
+                <w:sz w:val="17"/>
+              </w:rPr>
+              <w:t>KEY="$HEALTHCARE_API_KEY"</w:t>
             </w:r>
           </w:p>
         </w:tc>
@@ -7974,20 +8170,33 @@
                 <w:color w:val="1A1A2E"/>
                 <w:sz w:val="17"/>
               </w:rPr>
-              <w:t>curl -s "$BASE/health" \</w:t>
-            </w:r>
-          </w:p>
-          <w:p>
-            <w:pPr>
-              <w:spacing w:before="0" w:after="0"/>
-            </w:pPr>
-            <w:r>
-              <w:rPr>
-                <w:rFonts w:ascii="Courier New" w:hAnsi="Courier New"/>
-                <w:color w:val="1A1A2E"/>
-                <w:sz w:val="17"/>
-              </w:rPr>
-              <w:t xml:space="preserve">  -H "x-api-key: $KEY" \</w:t>
+              <w:t>curl -s \</w:t>
+            </w:r>
+          </w:p>
+          <w:p>
+            <w:pPr>
+              <w:spacing w:before="0" w:after="0"/>
+            </w:pPr>
+            <w:r>
+              <w:rPr>
+                <w:rFonts w:ascii="Courier New" w:hAnsi="Courier New"/>
+                <w:color w:val="1A1A2E"/>
+                <w:sz w:val="17"/>
+              </w:rPr>
+              <w:t xml:space="preserve">  "$HEALTHCARE_API_BASE/health" \</w:t>
+            </w:r>
+          </w:p>
+          <w:p>
+            <w:pPr>
+              <w:spacing w:before="0" w:after="0"/>
+            </w:pPr>
+            <w:r>
+              <w:rPr>
+                <w:rFonts w:ascii="Courier New" w:hAnsi="Courier New"/>
+                <w:color w:val="1A1A2E"/>
+                <w:sz w:val="17"/>
+              </w:rPr>
+              <w:t xml:space="preserve">  -H "x-api-key: $HEALTHCARE_API_KEY" \</w:t>
             </w:r>
           </w:p>
           <w:p>
@@ -8069,7 +8278,20 @@
                 <w:color w:val="1A1A2E"/>
                 <w:sz w:val="17"/>
               </w:rPr>
-              <w:t>curl -s -X POST "$BASE/classify" \</w:t>
+              <w:t>curl -s -X POST \</w:t>
+            </w:r>
+          </w:p>
+          <w:p>
+            <w:pPr>
+              <w:spacing w:before="0" w:after="0"/>
+            </w:pPr>
+            <w:r>
+              <w:rPr>
+                <w:rFonts w:ascii="Courier New" w:hAnsi="Courier New"/>
+                <w:color w:val="1A1A2E"/>
+                <w:sz w:val="17"/>
+              </w:rPr>
+              <w:t xml:space="preserve">  "$HEALTHCARE_API_BASE/classify" \</w:t>
             </w:r>
           </w:p>
           <w:p>
@@ -8095,7 +8317,7 @@
                 <w:color w:val="1A1A2E"/>
                 <w:sz w:val="17"/>
               </w:rPr>
-              <w:t xml:space="preserve">  -H "x-api-key: $KEY" \</w:t>
+              <w:t xml:space="preserve">  -H "x-api-key: $HEALTHCARE_API_KEY" \</w:t>
             </w:r>
           </w:p>
           <w:p>
@@ -8229,7 +8451,20 @@
                 <w:color w:val="1A1A2E"/>
                 <w:sz w:val="17"/>
               </w:rPr>
-              <w:t>curl -s -X POST "$BASE/classify" \</w:t>
+              <w:t>curl -s -X POST \</w:t>
+            </w:r>
+          </w:p>
+          <w:p>
+            <w:pPr>
+              <w:spacing w:before="0" w:after="0"/>
+            </w:pPr>
+            <w:r>
+              <w:rPr>
+                <w:rFonts w:ascii="Courier New" w:hAnsi="Courier New"/>
+                <w:color w:val="1A1A2E"/>
+                <w:sz w:val="17"/>
+              </w:rPr>
+              <w:t xml:space="preserve">  "$HEALTHCARE_API_BASE/classify" \</w:t>
             </w:r>
           </w:p>
           <w:p>
@@ -8255,7 +8490,7 @@
                 <w:color w:val="1A1A2E"/>
                 <w:sz w:val="17"/>
               </w:rPr>
-              <w:t xml:space="preserve">  -H "x-api-key: $KEY" \</w:t>
+              <w:t xml:space="preserve">  -H "x-api-key: $HEALTHCARE_API_KEY" \</w:t>
             </w:r>
           </w:p>
           <w:p>
@@ -8597,7 +8832,20 @@
                 <w:color w:val="1A1A2E"/>
                 <w:sz w:val="17"/>
               </w:rPr>
-              <w:t>curl -s -X POST "$BASE/classify" \</w:t>
+              <w:t>curl -s -X POST \</w:t>
+            </w:r>
+          </w:p>
+          <w:p>
+            <w:pPr>
+              <w:spacing w:before="0" w:after="0"/>
+            </w:pPr>
+            <w:r>
+              <w:rPr>
+                <w:rFonts w:ascii="Courier New" w:hAnsi="Courier New"/>
+                <w:color w:val="1A1A2E"/>
+                <w:sz w:val="17"/>
+              </w:rPr>
+              <w:t xml:space="preserve">  "$HEALTHCARE_API_BASE/classify" \</w:t>
             </w:r>
           </w:p>
           <w:p>
@@ -8623,7 +8871,7 @@
                 <w:color w:val="1A1A2E"/>
                 <w:sz w:val="17"/>
               </w:rPr>
-              <w:t xml:space="preserve">  -H "x-api-key: $KEY" \</w:t>
+              <w:t xml:space="preserve">  -H "x-api-key: $HEALTHCARE_API_KEY" \</w:t>
             </w:r>
           </w:p>
           <w:p>
@@ -8771,6 +9019,19 @@
                 <w:color w:val="1A1A2E"/>
                 <w:sz w:val="17"/>
               </w:rPr>
+              <w:t># Deliberately omit the key — expect 403</w:t>
+            </w:r>
+          </w:p>
+          <w:p>
+            <w:pPr>
+              <w:spacing w:before="0" w:after="0"/>
+            </w:pPr>
+            <w:r>
+              <w:rPr>
+                <w:rFonts w:ascii="Courier New" w:hAnsi="Courier New"/>
+                <w:color w:val="1A1A2E"/>
+                <w:sz w:val="17"/>
+              </w:rPr>
               <w:t>curl -s -o /dev/null -w "%{http_code}" \</w:t>
             </w:r>
           </w:p>
@@ -8784,7 +9045,20 @@
                 <w:color w:val="1A1A2E"/>
                 <w:sz w:val="17"/>
               </w:rPr>
-              <w:t xml:space="preserve">  -X POST "$BASE/classify" \</w:t>
+              <w:t xml:space="preserve">  -X POST \</w:t>
+            </w:r>
+          </w:p>
+          <w:p>
+            <w:pPr>
+              <w:spacing w:before="0" w:after="0"/>
+            </w:pPr>
+            <w:r>
+              <w:rPr>
+                <w:rFonts w:ascii="Courier New" w:hAnsi="Courier New"/>
+                <w:color w:val="1A1A2E"/>
+                <w:sz w:val="17"/>
+              </w:rPr>
+              <w:t xml:space="preserve">  "$HEALTHCARE_API_BASE/classify" \</w:t>
             </w:r>
           </w:p>
           <w:p>
@@ -8881,7 +9155,20 @@
                 <w:color w:val="1A1A2E"/>
                 <w:sz w:val="17"/>
               </w:rPr>
-              <w:t xml:space="preserve">  -X POST "$BASE/classify" \</w:t>
+              <w:t xml:space="preserve">  -X POST \</w:t>
+            </w:r>
+          </w:p>
+          <w:p>
+            <w:pPr>
+              <w:spacing w:before="0" w:after="0"/>
+            </w:pPr>
+            <w:r>
+              <w:rPr>
+                <w:rFonts w:ascii="Courier New" w:hAnsi="Courier New"/>
+                <w:color w:val="1A1A2E"/>
+                <w:sz w:val="17"/>
+              </w:rPr>
+              <w:t xml:space="preserve">  "$HEALTHCARE_API_BASE/classify" \</w:t>
             </w:r>
           </w:p>
           <w:p>
@@ -8978,7 +9265,20 @@
                 <w:color w:val="1A1A2E"/>
                 <w:sz w:val="17"/>
               </w:rPr>
-              <w:t>curl -s -X POST "$BASE/classify" \</w:t>
+              <w:t>curl -s -X POST \</w:t>
+            </w:r>
+          </w:p>
+          <w:p>
+            <w:pPr>
+              <w:spacing w:before="0" w:after="0"/>
+            </w:pPr>
+            <w:r>
+              <w:rPr>
+                <w:rFonts w:ascii="Courier New" w:hAnsi="Courier New"/>
+                <w:color w:val="1A1A2E"/>
+                <w:sz w:val="17"/>
+              </w:rPr>
+              <w:t xml:space="preserve">  "$HEALTHCARE_API_BASE/classify" \</w:t>
             </w:r>
           </w:p>
           <w:p>
@@ -9004,7 +9304,7 @@
                 <w:color w:val="1A1A2E"/>
                 <w:sz w:val="17"/>
               </w:rPr>
-              <w:t xml:space="preserve">  -H "x-api-key: $KEY" \</w:t>
+              <w:t xml:space="preserve">  -H "x-api-key: $HEALTHCARE_API_KEY" \</w:t>
             </w:r>
           </w:p>
           <w:p>
@@ -9088,7 +9388,20 @@
                 <w:color w:val="1A1A2E"/>
                 <w:sz w:val="17"/>
               </w:rPr>
-              <w:t>curl -s -X POST "$BASE/classify" \</w:t>
+              <w:t>curl -s -X POST \</w:t>
+            </w:r>
+          </w:p>
+          <w:p>
+            <w:pPr>
+              <w:spacing w:before="0" w:after="0"/>
+            </w:pPr>
+            <w:r>
+              <w:rPr>
+                <w:rFonts w:ascii="Courier New" w:hAnsi="Courier New"/>
+                <w:color w:val="1A1A2E"/>
+                <w:sz w:val="17"/>
+              </w:rPr>
+              <w:t xml:space="preserve">  "$HEALTHCARE_API_BASE/classify" \</w:t>
             </w:r>
           </w:p>
           <w:p>
@@ -9114,7 +9427,7 @@
                 <w:color w:val="1A1A2E"/>
                 <w:sz w:val="17"/>
               </w:rPr>
-              <w:t xml:space="preserve">  -H "x-api-key: $KEY" \</w:t>
+              <w:t xml:space="preserve">  -H "x-api-key: $HEALTHCARE_API_KEY" \</w:t>
             </w:r>
           </w:p>
           <w:p>
@@ -10249,45 +10562,84 @@
                 <w:color w:val="1A1A2E"/>
                 <w:sz w:val="17"/>
               </w:rPr>
-              <w:t># In a .env file (never committed to Git):</w:t>
-            </w:r>
-          </w:p>
-          <w:p>
-            <w:pPr>
-              <w:spacing w:before="0" w:after="0"/>
-            </w:pPr>
-            <w:r>
-              <w:rPr>
-                <w:rFonts w:ascii="Courier New" w:hAnsi="Courier New"/>
-                <w:color w:val="1A1A2E"/>
-                <w:sz w:val="17"/>
-              </w:rPr>
-              <w:t>#   API_KEY=ViHNt3GVMXz7bWfRnPTu1FvzR1Tvm8F19SgNlJ12</w:t>
-            </w:r>
-          </w:p>
-          <w:p>
-            <w:pPr>
-              <w:spacing w:before="0" w:after="0"/>
-            </w:pPr>
-            <w:r>
-              <w:rPr>
-                <w:rFonts w:ascii="Courier New" w:hAnsi="Courier New"/>
-                <w:color w:val="1A1A2E"/>
-                <w:sz w:val="17"/>
-              </w:rPr>
-            </w:r>
-          </w:p>
-          <w:p>
-            <w:pPr>
-              <w:spacing w:before="0" w:after="0"/>
-            </w:pPr>
-            <w:r>
-              <w:rPr>
-                <w:rFonts w:ascii="Courier New" w:hAnsi="Courier New"/>
-                <w:color w:val="1A1A2E"/>
-                <w:sz w:val="17"/>
-              </w:rPr>
-              <w:t>API_KEY = os.environ.get("API_KEY")</w:t>
+              <w:t># Retrieve the key at runtime — never hardcode it:</w:t>
+            </w:r>
+          </w:p>
+          <w:p>
+            <w:pPr>
+              <w:spacing w:before="0" w:after="0"/>
+            </w:pPr>
+            <w:r>
+              <w:rPr>
+                <w:rFonts w:ascii="Courier New" w:hAnsi="Courier New"/>
+                <w:color w:val="1A1A2E"/>
+                <w:sz w:val="17"/>
+              </w:rPr>
+              <w:t>#   export HEALTHCARE_API_KEY=$(aws apigateway get-api-keys \</w:t>
+            </w:r>
+          </w:p>
+          <w:p>
+            <w:pPr>
+              <w:spacing w:before="0" w:after="0"/>
+            </w:pPr>
+            <w:r>
+              <w:rPr>
+                <w:rFonts w:ascii="Courier New" w:hAnsi="Courier New"/>
+                <w:color w:val="1A1A2E"/>
+                <w:sz w:val="17"/>
+              </w:rPr>
+              <w:t>#     --region ap-southeast-2 --include-values \</w:t>
+            </w:r>
+          </w:p>
+          <w:p>
+            <w:pPr>
+              <w:spacing w:before="0" w:after="0"/>
+            </w:pPr>
+            <w:r>
+              <w:rPr>
+                <w:rFonts w:ascii="Courier New" w:hAnsi="Courier New"/>
+                <w:color w:val="1A1A2E"/>
+                <w:sz w:val="17"/>
+              </w:rPr>
+              <w:t>#     --query "items[?contains(name,'healthcare-topic-classifier')].value | [0]" \</w:t>
+            </w:r>
+          </w:p>
+          <w:p>
+            <w:pPr>
+              <w:spacing w:before="0" w:after="0"/>
+            </w:pPr>
+            <w:r>
+              <w:rPr>
+                <w:rFonts w:ascii="Courier New" w:hAnsi="Courier New"/>
+                <w:color w:val="1A1A2E"/>
+                <w:sz w:val="17"/>
+              </w:rPr>
+              <w:t>#     --output text)</w:t>
+            </w:r>
+          </w:p>
+          <w:p>
+            <w:pPr>
+              <w:spacing w:before="0" w:after="0"/>
+            </w:pPr>
+            <w:r>
+              <w:rPr>
+                <w:rFonts w:ascii="Courier New" w:hAnsi="Courier New"/>
+                <w:color w:val="1A1A2E"/>
+                <w:sz w:val="17"/>
+              </w:rPr>
+            </w:r>
+          </w:p>
+          <w:p>
+            <w:pPr>
+              <w:spacing w:before="0" w:after="0"/>
+            </w:pPr>
+            <w:r>
+              <w:rPr>
+                <w:rFonts w:ascii="Courier New" w:hAnsi="Courier New"/>
+                <w:color w:val="1A1A2E"/>
+                <w:sz w:val="17"/>
+              </w:rPr>
+              <w:t>API_KEY = os.environ.get("HEALTHCARE_API_KEY")</w:t>
             </w:r>
           </w:p>
           <w:p>
@@ -10313,7 +10665,7 @@
                 <w:color w:val="1A1A2E"/>
                 <w:sz w:val="17"/>
               </w:rPr>
-              <w:t xml:space="preserve">    raise ValueError("API_KEY environment variable is not set!")</w:t>
+              <w:t xml:space="preserve">    raise ValueError("HEALTHCARE_API_KEY environment variable is not set!")</w:t>
             </w:r>
           </w:p>
         </w:tc>
@@ -10370,7 +10722,7 @@
                 <w:color w:val="1A1A2E"/>
                 <w:sz w:val="17"/>
               </w:rPr>
-              <w:t>import requests</w:t>
+              <w:t>import os, requests</w:t>
             </w:r>
           </w:p>
           <w:p>
@@ -10421,20 +10773,46 @@
                 <w:color w:val="1A1A2E"/>
                 <w:sz w:val="17"/>
               </w:rPr>
-              <w:t xml:space="preserve">    url     = "https://5kzn638wee.execute-api.ap-southeast-2.amazonaws.com/prod/classify"</w:t>
-            </w:r>
-          </w:p>
-          <w:p>
-            <w:pPr>
-              <w:spacing w:before="0" w:after="0"/>
-            </w:pPr>
-            <w:r>
-              <w:rPr>
-                <w:rFonts w:ascii="Courier New" w:hAnsi="Courier New"/>
-                <w:color w:val="1A1A2E"/>
-                <w:sz w:val="17"/>
-              </w:rPr>
-              <w:t xml:space="preserve">    headers = {</w:t>
+              <w:t xml:space="preserve">    base_url = os.environ["HEALTHCARE_API_BASE"]   # e.g. https://&lt;id&gt;.execute-api.&lt;region&gt;.amazonaws.com/prod</w:t>
+            </w:r>
+          </w:p>
+          <w:p>
+            <w:pPr>
+              <w:spacing w:before="0" w:after="0"/>
+            </w:pPr>
+            <w:r>
+              <w:rPr>
+                <w:rFonts w:ascii="Courier New" w:hAnsi="Courier New"/>
+                <w:color w:val="1A1A2E"/>
+                <w:sz w:val="17"/>
+              </w:rPr>
+              <w:t xml:space="preserve">    api_key  = os.environ["HEALTHCARE_API_KEY"]    # retrieved via AWS CLI, never hardcoded</w:t>
+            </w:r>
+          </w:p>
+          <w:p>
+            <w:pPr>
+              <w:spacing w:before="0" w:after="0"/>
+            </w:pPr>
+            <w:r>
+              <w:rPr>
+                <w:rFonts w:ascii="Courier New" w:hAnsi="Courier New"/>
+                <w:color w:val="1A1A2E"/>
+                <w:sz w:val="17"/>
+              </w:rPr>
+              <w:t xml:space="preserve">    url      = f"{base_url}/classify"</w:t>
+            </w:r>
+          </w:p>
+          <w:p>
+            <w:pPr>
+              <w:spacing w:before="0" w:after="0"/>
+            </w:pPr>
+            <w:r>
+              <w:rPr>
+                <w:rFonts w:ascii="Courier New" w:hAnsi="Courier New"/>
+                <w:color w:val="1A1A2E"/>
+                <w:sz w:val="17"/>
+              </w:rPr>
+              <w:t xml:space="preserve">    headers  = {</w:t>
             </w:r>
           </w:p>
           <w:p>
@@ -10460,7 +10838,7 @@
                 <w:color w:val="1A1A2E"/>
                 <w:sz w:val="17"/>
               </w:rPr>
-              <w:t xml:space="preserve">        "x-api-key":    "ViHNt3GVMXz7bWfRnPTu1FvzR1Tvm8F19SgNlJ12",</w:t>
+              <w:t xml:space="preserve">        "x-api-key":    api_key,</w:t>
             </w:r>
           </w:p>
           <w:p>
@@ -12714,20 +13092,20 @@
                 <w:color w:val="1A1A2E"/>
                 <w:sz w:val="17"/>
               </w:rPr>
-              <w:t>BASE="https://5kzn638wee.execute-api.ap-southeast-2.amazonaws.com/prod"</w:t>
-            </w:r>
-          </w:p>
-          <w:p>
-            <w:pPr>
-              <w:spacing w:before="0" w:after="0"/>
-            </w:pPr>
-            <w:r>
-              <w:rPr>
-                <w:rFonts w:ascii="Courier New" w:hAnsi="Courier New"/>
-                <w:color w:val="1A1A2E"/>
-                <w:sz w:val="17"/>
-              </w:rPr>
-              <w:t>KEY="ViHNt3GVMXz7bWfRnPTu1FvzR1Tvm8F19SgNlJ12"</w:t>
+              <w:t>BASE="$HEALTHCARE_API_BASE"</w:t>
+            </w:r>
+          </w:p>
+          <w:p>
+            <w:pPr>
+              <w:spacing w:before="0" w:after="0"/>
+            </w:pPr>
+            <w:r>
+              <w:rPr>
+                <w:rFonts w:ascii="Courier New" w:hAnsi="Courier New"/>
+                <w:color w:val="1A1A2E"/>
+                <w:sz w:val="17"/>
+              </w:rPr>
+              <w:t>KEY="$HEALTHCARE_API_KEY"</w:t>
             </w:r>
           </w:p>
         </w:tc>
@@ -13224,7 +13602,20 @@
                 <w:color w:val="1A1A2E"/>
                 <w:sz w:val="17"/>
               </w:rPr>
-              <w:t>curl -s -X POST "$BASE/classify" \</w:t>
+              <w:t>curl -s -X POST \</w:t>
+            </w:r>
+          </w:p>
+          <w:p>
+            <w:pPr>
+              <w:spacing w:before="0" w:after="0"/>
+            </w:pPr>
+            <w:r>
+              <w:rPr>
+                <w:rFonts w:ascii="Courier New" w:hAnsi="Courier New"/>
+                <w:color w:val="1A1A2E"/>
+                <w:sz w:val="17"/>
+              </w:rPr>
+              <w:t xml:space="preserve">  "$HEALTHCARE_API_BASE/classify" \</w:t>
             </w:r>
           </w:p>
           <w:p>
@@ -13250,7 +13641,7 @@
                 <w:color w:val="1A1A2E"/>
                 <w:sz w:val="17"/>
               </w:rPr>
-              <w:t xml:space="preserve">  -H "x-api-key: $KEY" \</w:t>
+              <w:t xml:space="preserve">  -H "x-api-key: $HEALTHCARE_API_KEY" \</w:t>
             </w:r>
           </w:p>
           <w:p>
@@ -13321,7 +13712,7 @@
                 <w:color w:val="1A1A2E"/>
                 <w:sz w:val="17"/>
               </w:rPr>
-              <w:t>import requests</w:t>
+              <w:t>import os, requests</w:t>
             </w:r>
           </w:p>
           <w:p>
@@ -13347,7 +13738,7 @@
                 <w:color w:val="1A1A2E"/>
                 <w:sz w:val="17"/>
               </w:rPr>
-              <w:t xml:space="preserve">    "https://5kzn638wee.execute-api.ap-southeast-2.amazonaws.com/prod/classify",</w:t>
+              <w:t xml:space="preserve">    os.environ["HEALTHCARE_API_BASE"] + "/classify",</w:t>
             </w:r>
           </w:p>
           <w:p>
@@ -13373,7 +13764,7 @@
                 <w:color w:val="1A1A2E"/>
                 <w:sz w:val="17"/>
               </w:rPr>
-              <w:t xml:space="preserve">             "x-api-key": "ViHNt3GVMXz7bWfRnPTu1FvzR1Tvm8F19SgNlJ12"},</w:t>
+              <w:t xml:space="preserve">             "x-api-key": os.environ["HEALTHCARE_API_KEY"]},</w:t>
             </w:r>
           </w:p>
           <w:p>
@@ -15179,58 +15570,162 @@
                 <w:color w:val="1A1A2E"/>
                 <w:sz w:val="17"/>
               </w:rPr>
-              <w:t>import requests</w:t>
-            </w:r>
-          </w:p>
-          <w:p>
-            <w:pPr>
-              <w:spacing w:before="0" w:after="0"/>
-            </w:pPr>
-            <w:r>
-              <w:rPr>
-                <w:rFonts w:ascii="Courier New" w:hAnsi="Courier New"/>
-                <w:color w:val="1A1A2E"/>
-                <w:sz w:val="17"/>
-              </w:rPr>
-            </w:r>
-          </w:p>
-          <w:p>
-            <w:pPr>
-              <w:spacing w:before="0" w:after="0"/>
-            </w:pPr>
-            <w:r>
-              <w:rPr>
-                <w:rFonts w:ascii="Courier New" w:hAnsi="Courier New"/>
-                <w:color w:val="1A1A2E"/>
-                <w:sz w:val="17"/>
-              </w:rPr>
-              <w:t># ── Configuration ──────────────────────────────────────────────────────────────</w:t>
-            </w:r>
-          </w:p>
-          <w:p>
-            <w:pPr>
-              <w:spacing w:before="0" w:after="0"/>
-            </w:pPr>
-            <w:r>
-              <w:rPr>
-                <w:rFonts w:ascii="Courier New" w:hAnsi="Courier New"/>
-                <w:color w:val="1A1A2E"/>
-                <w:sz w:val="17"/>
-              </w:rPr>
-              <w:t>BASE_URL = "https://5kzn638wee.execute-api.ap-southeast-2.amazonaws.com/prod"</w:t>
-            </w:r>
-          </w:p>
-          <w:p>
-            <w:pPr>
-              <w:spacing w:before="0" w:after="0"/>
-            </w:pPr>
-            <w:r>
-              <w:rPr>
-                <w:rFonts w:ascii="Courier New" w:hAnsi="Courier New"/>
-                <w:color w:val="1A1A2E"/>
-                <w:sz w:val="17"/>
-              </w:rPr>
-              <w:t>API_KEY  = "ViHNt3GVMXz7bWfRnPTu1FvzR1Tvm8F19SgNlJ12"</w:t>
+              <w:t>import os, requests</w:t>
+            </w:r>
+          </w:p>
+          <w:p>
+            <w:pPr>
+              <w:spacing w:before="0" w:after="0"/>
+            </w:pPr>
+            <w:r>
+              <w:rPr>
+                <w:rFonts w:ascii="Courier New" w:hAnsi="Courier New"/>
+                <w:color w:val="1A1A2E"/>
+                <w:sz w:val="17"/>
+              </w:rPr>
+            </w:r>
+          </w:p>
+          <w:p>
+            <w:pPr>
+              <w:spacing w:before="0" w:after="0"/>
+            </w:pPr>
+            <w:r>
+              <w:rPr>
+                <w:rFonts w:ascii="Courier New" w:hAnsi="Courier New"/>
+                <w:color w:val="1A1A2E"/>
+                <w:sz w:val="17"/>
+              </w:rPr>
+              <w:t># ── Configuration — credentials from environment (never hardcoded) ─────────────</w:t>
+            </w:r>
+          </w:p>
+          <w:p>
+            <w:pPr>
+              <w:spacing w:before="0" w:after="0"/>
+            </w:pPr>
+            <w:r>
+              <w:rPr>
+                <w:rFonts w:ascii="Courier New" w:hAnsi="Courier New"/>
+                <w:color w:val="1A1A2E"/>
+                <w:sz w:val="17"/>
+              </w:rPr>
+              <w:t># Set before running:</w:t>
+            </w:r>
+          </w:p>
+          <w:p>
+            <w:pPr>
+              <w:spacing w:before="0" w:after="0"/>
+            </w:pPr>
+            <w:r>
+              <w:rPr>
+                <w:rFonts w:ascii="Courier New" w:hAnsi="Courier New"/>
+                <w:color w:val="1A1A2E"/>
+                <w:sz w:val="17"/>
+              </w:rPr>
+              <w:t>#   export HEALTHCARE_API_BASE=$(aws cloudformation describe-stacks \</w:t>
+            </w:r>
+          </w:p>
+          <w:p>
+            <w:pPr>
+              <w:spacing w:before="0" w:after="0"/>
+            </w:pPr>
+            <w:r>
+              <w:rPr>
+                <w:rFonts w:ascii="Courier New" w:hAnsi="Courier New"/>
+                <w:color w:val="1A1A2E"/>
+                <w:sz w:val="17"/>
+              </w:rPr>
+              <w:t>#     --stack-name healthcare-topic-classifier-stack --region ap-southeast-2 \</w:t>
+            </w:r>
+          </w:p>
+          <w:p>
+            <w:pPr>
+              <w:spacing w:before="0" w:after="0"/>
+            </w:pPr>
+            <w:r>
+              <w:rPr>
+                <w:rFonts w:ascii="Courier New" w:hAnsi="Courier New"/>
+                <w:color w:val="1A1A2E"/>
+                <w:sz w:val="17"/>
+              </w:rPr>
+              <w:t>#     --query "Stacks[0].Outputs[?OutputKey=='ApiEndpoint'].OutputValue" --output text)</w:t>
+            </w:r>
+          </w:p>
+          <w:p>
+            <w:pPr>
+              <w:spacing w:before="0" w:after="0"/>
+            </w:pPr>
+            <w:r>
+              <w:rPr>
+                <w:rFonts w:ascii="Courier New" w:hAnsi="Courier New"/>
+                <w:color w:val="1A1A2E"/>
+                <w:sz w:val="17"/>
+              </w:rPr>
+              <w:t>#   export HEALTHCARE_API_KEY=$(aws apigateway get-api-keys \</w:t>
+            </w:r>
+          </w:p>
+          <w:p>
+            <w:pPr>
+              <w:spacing w:before="0" w:after="0"/>
+            </w:pPr>
+            <w:r>
+              <w:rPr>
+                <w:rFonts w:ascii="Courier New" w:hAnsi="Courier New"/>
+                <w:color w:val="1A1A2E"/>
+                <w:sz w:val="17"/>
+              </w:rPr>
+              <w:t>#     --region ap-southeast-2 --include-values \</w:t>
+            </w:r>
+          </w:p>
+          <w:p>
+            <w:pPr>
+              <w:spacing w:before="0" w:after="0"/>
+            </w:pPr>
+            <w:r>
+              <w:rPr>
+                <w:rFonts w:ascii="Courier New" w:hAnsi="Courier New"/>
+                <w:color w:val="1A1A2E"/>
+                <w:sz w:val="17"/>
+              </w:rPr>
+              <w:t>#     --query "items[?contains(name,'healthcare-topic-classifier')].value | [0]" \</w:t>
+            </w:r>
+          </w:p>
+          <w:p>
+            <w:pPr>
+              <w:spacing w:before="0" w:after="0"/>
+            </w:pPr>
+            <w:r>
+              <w:rPr>
+                <w:rFonts w:ascii="Courier New" w:hAnsi="Courier New"/>
+                <w:color w:val="1A1A2E"/>
+                <w:sz w:val="17"/>
+              </w:rPr>
+              <w:t>#     --output text)</w:t>
+            </w:r>
+          </w:p>
+          <w:p>
+            <w:pPr>
+              <w:spacing w:before="0" w:after="0"/>
+            </w:pPr>
+            <w:r>
+              <w:rPr>
+                <w:rFonts w:ascii="Courier New" w:hAnsi="Courier New"/>
+                <w:color w:val="1A1A2E"/>
+                <w:sz w:val="17"/>
+              </w:rPr>
+              <w:t>BASE_URL = os.environ["HEALTHCARE_API_BASE"]</w:t>
+            </w:r>
+          </w:p>
+          <w:p>
+            <w:pPr>
+              <w:spacing w:before="0" w:after="0"/>
+            </w:pPr>
+            <w:r>
+              <w:rPr>
+                <w:rFonts w:ascii="Courier New" w:hAnsi="Courier New"/>
+                <w:color w:val="1A1A2E"/>
+                <w:sz w:val="17"/>
+              </w:rPr>
+              <w:t>API_KEY  = os.environ["HEALTHCARE_API_KEY"]</w:t>
             </w:r>
           </w:p>
           <w:p>

</xml_diff>